<commit_message>
Carlos Alberto: correcao da cronologia da briga com Silvio e material novo; pacote atualizado
Co-Authored-By: Claude Opus 5.5 <noreply@anthropic.com>
Claude-Session: https://claude.ai/code/session_01MJjUEEZrxQDEUifKK2vj9g
</commit_message>
<xml_diff>
--- a/roteiros/carlos-alberto/Carlos_Alberto_Roteiro.docx
+++ b/roteiros/carlos-alberto/Carlos_Alberto_Roteiro.docx
@@ -303,6 +303,22 @@
         <w:rPr>
           <w:color w:val="000000"/>
         </w:rPr>
+        <w:t>Os dois viraram amigos de verdade. Anos depois, Carlos Alberto contou que, durante a ditadura, quando agentes foram procurar livros na casa de Jô, foi ele quem escondeu os livros no próprio carro. E devolveu dias depois.</w:t>
+      </w:r>
+    </w:p>
+    <w:p>
+      <w:r>
+        <w:rPr>
+          <w:color w:val="000000"/>
+        </w:rPr>
+        <w:t>Quando Jô morreu, em dois mil e vinte e dois, Carlos Alberto não quis dar entrevistas. Gravou só um vídeo, chorando, e chamou o amigo de o maior gênio que surgiu na televisão brasileira.</w:t>
+      </w:r>
+    </w:p>
+    <w:p>
+      <w:r>
+        <w:rPr>
+          <w:color w:val="000000"/>
+        </w:rPr>
         <w:t>E no elenco estava, de novo, o amigo Ronald Golias.</w:t>
       </w:r>
     </w:p>
@@ -503,7 +519,39 @@
         <w:rPr>
           <w:color w:val="C00000"/>
         </w:rPr>
-        <w:t>Só que a vida não deu tempo para o luto. Porque, logo depois, Carlos Alberto foi trabalhar num dos programas de maior sucesso da história da televisão brasileira.</w:t>
+        <w:t>Só que, pouco tempo depois de enterrar o pai, Carlos Alberto disse em público uma frase que ia destruir a amizade mais importante da vida dele. E o alvo era Silvio Santos.</w:t>
+      </w:r>
+    </w:p>
+    <w:p>
+      <w:r>
+        <w:rPr>
+          <w:color w:val="000000"/>
+        </w:rPr>
+        <w:t>Numa entrevista de rádio, Carlos Alberto acusou Silvio de ter ficado com dez por cento do Baú da Felicidade que, segundo ele, eram da família.</w:t>
+      </w:r>
+    </w:p>
+    <w:p>
+      <w:r>
+        <w:rPr>
+          <w:color w:val="000000"/>
+        </w:rPr>
+        <w:t>E foi duro. Chamou aquilo de safadeza. De crueldade. E disparou ofensas contra o homem que o pai tinha levado para o Baú.</w:t>
+      </w:r>
+    </w:p>
+    <w:p>
+      <w:r>
+        <w:rPr>
+          <w:color w:val="000000"/>
+        </w:rPr>
+        <w:t>E os dois pararam de se falar.</w:t>
+      </w:r>
+    </w:p>
+    <w:p>
+      <w:r>
+        <w:rPr>
+          <w:color w:val="C00000"/>
+        </w:rPr>
+        <w:t>E, enquanto essa briga crescia, Carlos Alberto foi trabalhar num dos programas de maior sucesso da história da televisão brasileira. Na emissora concorrente.</w:t>
       </w:r>
     </w:p>
     <w:p>
@@ -519,7 +567,15 @@
         <w:rPr>
           <w:color w:val="000000"/>
         </w:rPr>
-        <w:t>Na Globo, Carlos Alberto virou roteirista e diretor. E ainda aparecia em cena.</w:t>
+        <w:t>Na Globo, a partir de mil novecentos e setenta e sete, Carlos Alberto virou roteirista e diretor. E ainda aparecia em cena.</w:t>
+      </w:r>
+    </w:p>
+    <w:p>
+      <w:r>
+        <w:rPr>
+          <w:color w:val="000000"/>
+        </w:rPr>
+        <w:t>Segundo Dedé Santana, foi Carlos Alberto quem ajudou a formar a dupla com Didi, ainda nos primeiros tempos.</w:t>
       </w:r>
     </w:p>
     <w:p>
@@ -551,7 +607,7 @@
         <w:rPr>
           <w:color w:val="000000"/>
         </w:rPr>
-        <w:t>Anos depois, ele contou como foi a conversa com Renato Aragão.</w:t>
+        <w:t>Segundo Carlos Alberto, Renato Aragão tinha crescido muito. E começou a reclamar até da presença dele no camarim.</w:t>
       </w:r>
     </w:p>
     <w:p>
@@ -559,23 +615,7 @@
         <w:rPr>
           <w:color w:val="000000"/>
         </w:rPr>
-        <w:t>Disse que uma situação naquela relação de trabalho o deixou magoado. Contou que achou aquilo uma ofensa.</w:t>
-      </w:r>
-    </w:p>
-    <w:p>
-      <w:r>
-        <w:rPr>
-          <w:color w:val="000000"/>
-        </w:rPr>
-        <w:t>E disse uma frase a Renato que nunca esqueceu.</w:t>
-      </w:r>
-    </w:p>
-    <w:p>
-      <w:r>
-        <w:rPr>
-          <w:color w:val="000000"/>
-        </w:rPr>
-        <w:t>Que preferia ser amigo dele a continuar trabalhando com ele.</w:t>
+        <w:t>Carlos Alberto contou que achou aquilo uma ofensa. E que disse a Renato que preferia ser amigo dele a continuar trabalhando com ele.</w:t>
       </w:r>
     </w:p>
     <w:p>
@@ -591,7 +631,7 @@
         <w:rPr>
           <w:color w:val="000000"/>
         </w:rPr>
-        <w:t>Em mil novecentos e oitenta e sete, Carlos Alberto tinha cinquenta e um anos.</w:t>
+        <w:t>Renato Aragão conta outra versão. Disse, anos depois, que nunca houve briga. E que não sabe por que o amigo se afastou.</w:t>
       </w:r>
     </w:p>
     <w:p>
@@ -599,7 +639,15 @@
         <w:rPr>
           <w:color w:val="000000"/>
         </w:rPr>
-        <w:t>E foi aí que teve uma ideia que unia o passado e o futuro.</w:t>
+        <w:t>Em mil novecentos e oitenta e sete, Carlos Alberto tinha cinquenta e um anos. Estava fora da Globo. E continuava sem falar com Silvio Santos havia mais de dez anos.</w:t>
+      </w:r>
+    </w:p>
+    <w:p>
+      <w:r>
+        <w:rPr>
+          <w:color w:val="000000"/>
+        </w:rPr>
+        <w:t>Ele tentou recomeçar na Band, com um programa chamado Praça Brasil. Durou só quatro episódios.</w:t>
       </w:r>
     </w:p>
     <w:p>
@@ -607,7 +655,7 @@
         <w:rPr>
           <w:color w:val="C00000"/>
         </w:rPr>
-        <w:t>Ele ia trazer de volta o banco da praça do pai. Só que, desta vez, quem ia sentar nele era o próprio filho.</w:t>
+        <w:t>E foi aí que aconteceu uma coisa que parece cena de filme. Porque a briga mais longa da vida dele terminou por causa de um sonho.</w:t>
       </w:r>
     </w:p>
     <w:p>
@@ -615,7 +663,39 @@
         <w:rPr>
           <w:color w:val="000000"/>
         </w:rPr>
-        <w:t>Depois de uma rápida passagem pela Band, Carlos Alberto chegou ao SBT, a emissora de Silvio Santos.</w:t>
+        <w:t>Segundo o próprio Carlos Alberto, ele começou a sonhar com Silvio Santos. E, no sonho, o pai, Manoel de Nóbrega, aparecia. E dizia que os dois eram como irmãos. Que não queria ver os dois brigados.</w:t>
+      </w:r>
+    </w:p>
+    <w:p>
+      <w:r>
+        <w:rPr>
+          <w:color w:val="000000"/>
+        </w:rPr>
+        <w:t>Carlos Alberto procurou Silvio.</w:t>
+      </w:r>
+    </w:p>
+    <w:p>
+      <w:r>
+        <w:rPr>
+          <w:color w:val="000000"/>
+        </w:rPr>
+        <w:t>Quando se encontraram, Silvio fez uma pergunta simples. Perguntou por que eles tinham brigado.</w:t>
+      </w:r>
+    </w:p>
+    <w:p>
+      <w:r>
+        <w:rPr>
+          <w:color w:val="000000"/>
+        </w:rPr>
+        <w:t>E a amizade voltou.</w:t>
+      </w:r>
+    </w:p>
+    <w:p>
+      <w:r>
+        <w:rPr>
+          <w:color w:val="000000"/>
+        </w:rPr>
+        <w:t>Silvio convenceu Carlos Alberto a levar o programa para o SBT. Carlos Alberto contou que nem discutiu salário. Só pediu liberdade para trabalhar.</w:t>
       </w:r>
     </w:p>
     <w:p>
@@ -637,9 +717,9 @@
     <w:p>
       <w:r>
         <w:rPr>
-          <w:color w:val="000000"/>
+          <w:color w:val="C00000"/>
         </w:rPr>
-        <w:t>E sentado nele, recebendo um desfile de personagens, estava o filho de Manoel de Nóbrega.</w:t>
+        <w:t>E, no primeiro programa, sentado naquele banco ao lado de Carlos Alberto, estava o próprio Silvio Santos. O homem com quem ele tinha passado mais de dez anos sem trocar uma palavra.</w:t>
       </w:r>
     </w:p>
     <w:p>
@@ -647,7 +727,7 @@
         <w:rPr>
           <w:color w:val="000000"/>
         </w:rPr>
-        <w:t>Exatamente como o pai tinha feito, trinta anos antes.</w:t>
+        <w:t>Exatamente como o pai tinha feito, trinta anos antes, o filho de Manoel de Nóbrega agora recebia um desfile de personagens.</w:t>
       </w:r>
     </w:p>
     <w:p>
@@ -655,7 +735,7 @@
         <w:rPr>
           <w:color w:val="000000"/>
         </w:rPr>
-        <w:t>O programa virou um fenômeno. Já são mais de mil e seiscentos episódios.</w:t>
+        <w:t>O programa virou um fenômeno. Já são mais de mil e seiscentos episódios e cerca de duzentos e cinquenta personagens.</w:t>
       </w:r>
     </w:p>
     <w:p>
@@ -687,7 +767,15 @@
         <w:rPr>
           <w:color w:val="C00000"/>
         </w:rPr>
-        <w:t>Só que, enquanto a Praça crescia, a relação com o homem que tinha aberto as portas do SBT para ele ia desmoronar. E Carlos Alberto ia passar onze anos sem falar com Silvio Santos.</w:t>
+        <w:t>Só que a história com Silvio Santos ainda guardava uma revelação. Porque, anos depois, Carlos Alberto contou o que Silvio tinha feito pela família dele enquanto os dois ainda eram amigos. E aquilo muda tudo o que se sabe sobre aquela briga.</w:t>
+      </w:r>
+    </w:p>
+    <w:p>
+      <w:r>
+        <w:rPr>
+          <w:color w:val="1F4EB4"/>
+        </w:rPr>
+        <w:t>Segundo Carlos Alberto, quando o pai ficou doente, no fim de mil novecentos e setenta e cinco, foi Silvio Santos quem pagou todo o tratamento. Inclusive as cirurgias. E nunca pediu recibo.</w:t>
       </w:r>
     </w:p>
     <w:p>
@@ -695,7 +783,7 @@
         <w:rPr>
           <w:color w:val="000000"/>
         </w:rPr>
-        <w:t>Onze anos.</w:t>
+        <w:t>Ou seja, pouco antes da acusação dos dez por cento, Silvio tinha pago o tratamento do pai dele.</w:t>
       </w:r>
     </w:p>
     <w:p>
@@ -703,7 +791,7 @@
         <w:rPr>
           <w:color w:val="000000"/>
         </w:rPr>
-        <w:t>Foi o tempo que Carlos Alberto de Nóbrega e Silvio Santos passaram brigados.</w:t>
+        <w:t>Anos depois, Carlos Alberto voltou atrás. Disse que não tinha direito àqueles dez por cento. Que tinha sido influenciado por outras pessoas. Usou uma palavra forte. Disse que o envenenaram.</w:t>
       </w:r>
     </w:p>
     <w:p>
@@ -711,7 +799,7 @@
         <w:rPr>
           <w:color w:val="000000"/>
         </w:rPr>
-        <w:t>Os dois homens ligados por uma história que começou com o pai de Carlos Alberto e o Baú da Felicidade, de repente, não se falavam mais.</w:t>
+        <w:t>E assumiu a culpa pela briga.</w:t>
       </w:r>
     </w:p>
     <w:p>
@@ -719,7 +807,7 @@
         <w:rPr>
           <w:color w:val="000000"/>
         </w:rPr>
-        <w:t>Carlos Alberto chegou a se afastar do SBT.</w:t>
+        <w:t>Contou também que, quando se separou da primeira esposa, pediu dinheiro emprestado a Silvio para comprar uma casa. E que Silvio respondeu que não ia emprestar nada. Que ele escolhesse uma casa. Segundo Carlos Alberto, foi um presente de duzentos mil dólares.</w:t>
       </w:r>
     </w:p>
     <w:p>
@@ -727,15 +815,7 @@
         <w:rPr>
           <w:color w:val="000000"/>
         </w:rPr>
-        <w:t>O motivo exato dessa briga nunca ficou claro em público.</w:t>
-      </w:r>
-    </w:p>
-    <w:p>
-      <w:r>
-        <w:rPr>
-          <w:color w:val="C00000"/>
-        </w:rPr>
-        <w:t>Só que o jeito como essa briga terminou é tão inesperado que parece cena de filme. Porque tudo começou com um sonho.</w:t>
+        <w:t>Ele resumiu o amigo numa frase. Disse que Silvio tinha vergonha de ser bondoso.</w:t>
       </w:r>
     </w:p>
     <w:p>
@@ -743,47 +823,7 @@
         <w:rPr>
           <w:color w:val="000000"/>
         </w:rPr>
-        <w:t>Segundo o próprio Carlos Alberto, uma noite ele sonhou com Silvio Santos. E sonhou também com o pai, Manoel de Nóbrega.</w:t>
-      </w:r>
-    </w:p>
-    <w:p>
-      <w:r>
-        <w:rPr>
-          <w:color w:val="000000"/>
-        </w:rPr>
-        <w:t>Acordou com aquilo na cabeça.</w:t>
-      </w:r>
-    </w:p>
-    <w:p>
-      <w:r>
-        <w:rPr>
-          <w:color w:val="000000"/>
-        </w:rPr>
-        <w:t>E decidiu procurar o velho amigo.</w:t>
-      </w:r>
-    </w:p>
-    <w:p>
-      <w:r>
-        <w:rPr>
-          <w:color w:val="000000"/>
-        </w:rPr>
-        <w:t>Quando os dois finalmente se encontraram, Silvio fez uma pergunta simples. Perguntou por que eles tinham brigado.</w:t>
-      </w:r>
-    </w:p>
-    <w:p>
-      <w:r>
-        <w:rPr>
-          <w:color w:val="000000"/>
-        </w:rPr>
-        <w:t>E a amizade voltou.</w:t>
-      </w:r>
-    </w:p>
-    <w:p>
-      <w:r>
-        <w:rPr>
-          <w:color w:val="000000"/>
-        </w:rPr>
-        <w:t>Segundo relatos publicados na imprensa, Silvio deu a Carlos Alberto uma garantia que valia ouro. A Praça seria dele. Ninguém ia mexer no programa.</w:t>
+        <w:t>E, segundo relatos publicados na imprensa, Silvio ainda deu a Carlos Alberto uma garantia que valia ouro. A Praça seria dele. Ninguém da família ia mexer no programa.</w:t>
       </w:r>
     </w:p>
     <w:p>
@@ -808,6 +848,22 @@
           <w:color w:val="000000"/>
         </w:rPr>
         <w:t>O comediante que estava ao lado de Carlos Alberto desde aquele estúdio pequeno da TV Paulista. E com quem ele ainda tinha dividido, nos anos noventa, a Escolinha do Golias, onde Carlos Alberto vivia o Professor Cagliostro.</w:t>
+      </w:r>
+    </w:p>
+    <w:p>
+      <w:r>
+        <w:rPr>
+          <w:color w:val="000000"/>
+        </w:rPr>
+        <w:t>No velório, Carlos Alberto disse que a história dos dois era uma só. Que as vidas deles se confundiam. E, antes de ir embora, de madrugada, deu um beijo na testa do amigo.</w:t>
+      </w:r>
+    </w:p>
+    <w:p>
+      <w:r>
+        <w:rPr>
+          <w:color w:val="000000"/>
+        </w:rPr>
+        <w:t>Anos depois, explicou o tamanho daquela relação. Disse que, nos últimos dez anos, tinha sido como um pai para Golias.</w:t>
       </w:r>
     </w:p>
     <w:p>
@@ -959,7 +1015,23 @@
         <w:rPr>
           <w:color w:val="000000"/>
         </w:rPr>
-        <w:t>O primeiro aviso veio em outubro de dois mil e vinte e um.</w:t>
+        <w:t>O primeiro aviso veio em dois mil e vinte e um.</w:t>
+      </w:r>
+    </w:p>
+    <w:p>
+      <w:r>
+        <w:rPr>
+          <w:color w:val="000000"/>
+        </w:rPr>
+        <w:t>Em fevereiro daquele ano, em plena pandemia, Carlos Alberto e a esposa, Renata, foram internados com covid. Os dois venceram. E, ao receber alta, ele mandou um recado curto para os fãs. Disse que estava de volta.</w:t>
+      </w:r>
+    </w:p>
+    <w:p>
+      <w:r>
+        <w:rPr>
+          <w:color w:val="000000"/>
+        </w:rPr>
+        <w:t>Só que, em outubro, veio um susto no coração.</w:t>
       </w:r>
     </w:p>
     <w:p>
@@ -983,23 +1055,7 @@
         <w:rPr>
           <w:color w:val="000000"/>
         </w:rPr>
-        <w:t>Naquela época, o país ainda vivia a pandemia. E Carlos Alberto também enfrentou a covid.</w:t>
-      </w:r>
-    </w:p>
-    <w:p>
-      <w:r>
-        <w:rPr>
-          <w:color w:val="000000"/>
-        </w:rPr>
-        <w:t>Venceu. Quando recebeu alta, mandou um recado curto para os fãs. Disse que estava de volta.</w:t>
-      </w:r>
-    </w:p>
-    <w:p>
-      <w:r>
-        <w:rPr>
-          <w:color w:val="000000"/>
-        </w:rPr>
-        <w:t>Parecia só um susto.</w:t>
+        <w:t>Parecia só mais um susto.</w:t>
       </w:r>
     </w:p>
     <w:p>
@@ -1511,7 +1567,7 @@
         <w:rPr>
           <w:color w:val="1F4EB4"/>
         </w:rPr>
-        <w:t>O diagnóstico foi uma infecção causada por um vírus chamado Coxsackie, do tipo dois.</w:t>
+        <w:t>O diagnóstico foi uma infecção causada por um vírus chamado Coxsackie.</w:t>
       </w:r>
     </w:p>
     <w:p>
@@ -1797,6 +1853,14 @@
     <w:p>
       <w:r>
         <w:rPr>
+          <w:color w:val="000000"/>
+        </w:rPr>
+        <w:t>E essa carta não é uma carta qualquer. Numa entrevista em dois mil e vinte e três, ele disse que ela é a bíblia dele. Que faz exatamente o que o pai pediu. E contou que não consegue mais reler. Porque o próprio médico pediu que ele não fizesse isso.</w:t>
+      </w:r>
+    </w:p>
+    <w:p>
+      <w:r>
+        <w:rPr>
           <w:color w:val="C00000"/>
         </w:rPr>
         <w:t>E, em abril de dois mil e vinte e seis, um mês depois de completar noventa anos, Carlos Alberto viveu outro momento que mostra que a família dele continua crescendo. E que o banco da praça pode ter herdeiros por muito tempo.</w:t>
@@ -1896,6 +1960,30 @@
           <w:color w:val="000000"/>
         </w:rPr>
         <w:t>Os sustos vieram. O medo existe. Ele mesmo admitiu.</w:t>
+      </w:r>
+    </w:p>
+    <w:p>
+      <w:r>
+        <w:rPr>
+          <w:color w:val="000000"/>
+        </w:rPr>
+        <w:t>Anos atrás, numa entrevista, ele confessou um medo que diz muito sobre esse homem. Disse que tinha muito medo de morrer sozinho.</w:t>
+      </w:r>
+    </w:p>
+    <w:p>
+      <w:r>
+        <w:rPr>
+          <w:color w:val="000000"/>
+        </w:rPr>
+        <w:t>E a vida respondeu a esse medo com uma família enorme. Uma esposa ao lado, seis filhos, netos, um bisneto. E um banco cheio de gente.</w:t>
+      </w:r>
+    </w:p>
+    <w:p>
+      <w:r>
+        <w:rPr>
+          <w:color w:val="000000"/>
+        </w:rPr>
+        <w:t>Na mesma entrevista, disse uma frase que explica por que ele não larga a Praça. Enquanto existir a Praça, o pai dele vai existir.</w:t>
       </w:r>
     </w:p>
     <w:p>

</xml_diff>